<commit_message>
Update: Ticket history, controllers, models, and UI improvements
</commit_message>
<xml_diff>
--- a/public/assets/generatePDF/template_technical.docx
+++ b/public/assets/generatePDF/template_technical.docx
@@ -270,14 +270,147 @@
           <w:rFonts w:ascii="Lexend" w:eastAsia="Lexend" w:hAnsi="Lexend" w:cs="Lexend"/>
           <w:color w:val="193989"/>
         </w:rPr>
-        <w:t xml:space="preserve">. This concern was classified under  </w:t>
-      </w:r>
-      <w:r>
-        <w:rPr>
-          <w:rFonts w:ascii="Lexend" w:eastAsia="Lexend" w:hAnsi="Lexend" w:cs="Lexend"/>
-          <w:b/>
-          <w:bCs/>
-          <w:color w:val="193989"/>
+        <w:t xml:space="preserve">. This concern was classified </w:t>
+      </w:r>
+      <w:proofErr w:type="gramStart"/>
+      <w:r>
+        <w:rPr>
+          <w:rFonts w:ascii="Lexend" w:eastAsia="Lexend" w:hAnsi="Lexend" w:cs="Lexend"/>
+          <w:color w:val="193989"/>
+        </w:rPr>
+        <w:t xml:space="preserve">under  </w:t>
+      </w:r>
+      <w:r>
+        <w:rPr>
+          <w:rFonts w:ascii="Lexend" w:eastAsia="Lexend" w:hAnsi="Lexend" w:cs="Lexend"/>
+          <w:b/>
+          <w:bCs/>
+          <w:color w:val="193989"/>
+        </w:rPr>
+        <w:t>$</w:t>
+      </w:r>
+      <w:proofErr w:type="gramEnd"/>
+      <w:r>
+        <w:rPr>
+          <w:rFonts w:ascii="Lexend" w:eastAsia="Lexend" w:hAnsi="Lexend" w:cs="Lexend"/>
+          <w:b/>
+          <w:bCs/>
+          <w:color w:val="193989"/>
+        </w:rPr>
+        <w:t>{</w:t>
+      </w:r>
+      <w:proofErr w:type="spellStart"/>
+      <w:r>
+        <w:rPr>
+          <w:rFonts w:ascii="Lexend" w:eastAsia="Lexend" w:hAnsi="Lexend" w:cs="Lexend"/>
+          <w:b/>
+          <w:bCs/>
+          <w:color w:val="193989"/>
+        </w:rPr>
+        <w:t>technical_purpose</w:t>
+      </w:r>
+      <w:proofErr w:type="spellEnd"/>
+      <w:r>
+        <w:rPr>
+          <w:rFonts w:ascii="Lexend" w:eastAsia="Lexend" w:hAnsi="Lexend" w:cs="Lexend"/>
+          <w:b/>
+          <w:bCs/>
+          <w:color w:val="193989"/>
+        </w:rPr>
+        <w:t>}</w:t>
+      </w:r>
+      <w:r>
+        <w:rPr>
+          <w:rFonts w:ascii="Lexend" w:eastAsia="Lexend" w:hAnsi="Lexend" w:cs="Lexend"/>
+          <w:color w:val="193989"/>
+        </w:rPr>
+        <w:t xml:space="preserve">. </w:t>
+      </w:r>
+    </w:p>
+    <w:p>
+      <w:pPr>
+        <w:spacing w:line="360" w:lineRule="auto"/>
+        <w:ind w:left="0" w:right="0"/>
+        <w:jc w:val="both"/>
+        <w:rPr>
+          <w:rFonts w:ascii="Lexend" w:eastAsia="Lexend" w:hAnsi="Lexend" w:cs="Lexend"/>
+          <w:color w:val="193989"/>
+        </w:rPr>
+      </w:pPr>
+    </w:p>
+    <w:p>
+      <w:pPr>
+        <w:spacing w:line="360" w:lineRule="auto"/>
+        <w:ind w:left="0" w:right="0"/>
+        <w:jc w:val="both"/>
+        <w:rPr>
+          <w:rFonts w:ascii="Lexend" w:eastAsia="Lexend" w:hAnsi="Lexend" w:cs="Lexend"/>
+          <w:color w:val="193989"/>
+        </w:rPr>
+      </w:pPr>
+      <w:r>
+        <w:rPr>
+          <w:rFonts w:ascii="Lexend" w:eastAsia="Lexend" w:hAnsi="Lexend" w:cs="Lexend"/>
+          <w:color w:val="193989"/>
+        </w:rPr>
+        <w:t>By signing this document, I acknowledge the actions taken by the IT team and waive any accountability for potential risks arising after the initial resolution. I also confirm that I have been fully informed of matters within my responsibility.</w:t>
+      </w:r>
+    </w:p>
+    <w:p>
+      <w:pPr>
+        <w:spacing w:line="360" w:lineRule="auto"/>
+        <w:ind w:left="0" w:right="0"/>
+        <w:rPr>
+          <w:rFonts w:ascii="Lexend" w:eastAsia="Lexend" w:hAnsi="Lexend" w:cs="Lexend"/>
+          <w:color w:val="193989"/>
+        </w:rPr>
+      </w:pPr>
+    </w:p>
+    <w:p>
+      <w:pPr>
+        <w:spacing w:line="360" w:lineRule="auto"/>
+        <w:ind w:left="0" w:right="0"/>
+        <w:rPr>
+          <w:rFonts w:ascii="Lexend" w:eastAsia="Lexend" w:hAnsi="Lexend" w:cs="Lexend"/>
+          <w:b/>
+          <w:bCs/>
+          <w:color w:val="193989"/>
+        </w:rPr>
+      </w:pPr>
+      <w:r>
+        <w:rPr>
+          <w:rFonts w:ascii="Lexend" w:eastAsia="Lexend" w:hAnsi="Lexend" w:cs="Lexend"/>
+          <w:b/>
+          <w:bCs/>
+          <w:color w:val="193989"/>
+        </w:rPr>
+        <w:t xml:space="preserve">Details of the Concern: </w:t>
+      </w:r>
+    </w:p>
+    <w:p>
+      <w:pPr>
+        <w:ind w:left="0" w:right="0"/>
+        <w:rPr>
+          <w:rFonts w:ascii="Lexend" w:eastAsia="Lexend" w:hAnsi="Lexend" w:cs="Lexend"/>
+          <w:color w:val="193989"/>
+        </w:rPr>
+      </w:pPr>
+    </w:p>
+    <w:p>
+      <w:pPr>
+        <w:ind w:left="0" w:right="0"/>
+        <w:jc w:val="center"/>
+        <w:rPr>
+          <w:rFonts w:ascii="Lexend" w:eastAsia="Lexend" w:hAnsi="Lexend" w:cs="Lexend"/>
+          <w:color w:val="193989"/>
+          <w:u w:val="single"/>
+        </w:rPr>
+      </w:pPr>
+      <w:r>
+        <w:rPr>
+          <w:rFonts w:ascii="Lexend" w:eastAsia="Lexend" w:hAnsi="Lexend" w:cs="Lexend"/>
+          <w:color w:val="193989"/>
+          <w:u w:val="single"/>
         </w:rPr>
         <w:t>${</w:t>
       </w:r>
@@ -285,35 +418,25 @@
       <w:r>
         <w:rPr>
           <w:rFonts w:ascii="Lexend" w:eastAsia="Lexend" w:hAnsi="Lexend" w:cs="Lexend"/>
-          <w:b/>
-          <w:bCs/>
-          <w:color w:val="193989"/>
-        </w:rPr>
-        <w:t>technical_purpose</w:t>
+          <w:color w:val="193989"/>
+          <w:u w:val="single"/>
+        </w:rPr>
+        <w:t>concern_details</w:t>
       </w:r>
       <w:proofErr w:type="spellEnd"/>
       <w:r>
         <w:rPr>
           <w:rFonts w:ascii="Lexend" w:eastAsia="Lexend" w:hAnsi="Lexend" w:cs="Lexend"/>
-          <w:b/>
-          <w:bCs/>
-          <w:color w:val="193989"/>
+          <w:color w:val="193989"/>
+          <w:u w:val="single"/>
         </w:rPr>
         <w:t>}</w:t>
       </w:r>
-      <w:r>
-        <w:rPr>
-          <w:rFonts w:ascii="Lexend" w:eastAsia="Lexend" w:hAnsi="Lexend" w:cs="Lexend"/>
-          <w:color w:val="193989"/>
-        </w:rPr>
-        <w:t xml:space="preserve">. </w:t>
-      </w:r>
     </w:p>
     <w:p>
       <w:pPr>
         <w:spacing w:line="360" w:lineRule="auto"/>
         <w:ind w:left="0" w:right="0"/>
-        <w:jc w:val="both"/>
         <w:rPr>
           <w:rFonts w:ascii="Lexend" w:eastAsia="Lexend" w:hAnsi="Lexend" w:cs="Lexend"/>
           <w:color w:val="193989"/>
@@ -324,64 +447,37 @@
       <w:pPr>
         <w:spacing w:line="360" w:lineRule="auto"/>
         <w:ind w:left="0" w:right="0"/>
-        <w:jc w:val="both"/>
-        <w:rPr>
-          <w:rFonts w:ascii="Lexend" w:eastAsia="Lexend" w:hAnsi="Lexend" w:cs="Lexend"/>
-          <w:color w:val="193989"/>
-        </w:rPr>
-      </w:pPr>
-      <w:r>
-        <w:rPr>
-          <w:rFonts w:ascii="Lexend" w:eastAsia="Lexend" w:hAnsi="Lexend" w:cs="Lexend"/>
-          <w:color w:val="193989"/>
-        </w:rPr>
-        <w:t>By signing this document, I acknowledge the actions taken by the IT team and waive any accountability for potential risks arising after the initial resolution. I also confirm that I have been fully informed of matters within my responsibility.</w:t>
-      </w:r>
-    </w:p>
-    <w:p>
-      <w:pPr>
-        <w:spacing w:line="360" w:lineRule="auto"/>
-        <w:ind w:left="0" w:right="0"/>
-        <w:rPr>
-          <w:rFonts w:ascii="Lexend" w:eastAsia="Lexend" w:hAnsi="Lexend" w:cs="Lexend"/>
-          <w:color w:val="193989"/>
-        </w:rPr>
-      </w:pPr>
-    </w:p>
-    <w:p>
-      <w:pPr>
-        <w:spacing w:line="360" w:lineRule="auto"/>
-        <w:ind w:left="0" w:right="0"/>
-        <w:rPr>
-          <w:rFonts w:ascii="Lexend" w:eastAsia="Lexend" w:hAnsi="Lexend" w:cs="Lexend"/>
-          <w:b/>
-          <w:bCs/>
-          <w:color w:val="193989"/>
-        </w:rPr>
-      </w:pPr>
-      <w:r>
-        <w:rPr>
-          <w:rFonts w:ascii="Lexend" w:eastAsia="Lexend" w:hAnsi="Lexend" w:cs="Lexend"/>
-          <w:b/>
-          <w:bCs/>
-          <w:color w:val="193989"/>
-        </w:rPr>
-        <w:t xml:space="preserve">Details of the Concern: </w:t>
-      </w:r>
-    </w:p>
-    <w:p>
-      <w:pPr>
-        <w:ind w:left="0" w:right="0"/>
-        <w:rPr>
-          <w:rFonts w:ascii="Lexend" w:eastAsia="Lexend" w:hAnsi="Lexend" w:cs="Lexend"/>
-          <w:color w:val="193989"/>
-        </w:rPr>
-      </w:pPr>
-    </w:p>
-    <w:p>
-      <w:pPr>
-        <w:ind w:left="0" w:right="0"/>
-        <w:jc w:val="center"/>
+        <w:rPr>
+          <w:rFonts w:ascii="Lexend" w:eastAsia="Lexend" w:hAnsi="Lexend" w:cs="Lexend"/>
+          <w:b/>
+          <w:bCs/>
+          <w:color w:val="193989"/>
+        </w:rPr>
+      </w:pPr>
+      <w:r>
+        <w:rPr>
+          <w:rFonts w:ascii="Lexend" w:eastAsia="Lexend" w:hAnsi="Lexend" w:cs="Lexend"/>
+          <w:b/>
+          <w:bCs/>
+          <w:color w:val="193989"/>
+        </w:rPr>
+        <w:t xml:space="preserve">Action Taken:  </w:t>
+      </w:r>
+    </w:p>
+    <w:p>
+      <w:pPr>
+        <w:ind w:left="0" w:right="0"/>
+        <w:rPr>
+          <w:rFonts w:ascii="Lexend" w:eastAsia="Lexend" w:hAnsi="Lexend" w:cs="Lexend"/>
+          <w:b/>
+          <w:bCs/>
+          <w:color w:val="193989"/>
+        </w:rPr>
+      </w:pPr>
+    </w:p>
+    <w:p>
+      <w:pPr>
+        <w:ind w:left="0" w:right="0"/>
         <w:rPr>
           <w:rFonts w:ascii="Lexend" w:eastAsia="Lexend" w:hAnsi="Lexend" w:cs="Lexend"/>
           <w:color w:val="193989"/>
@@ -403,7 +499,7 @@
           <w:color w:val="193989"/>
           <w:u w:val="single"/>
         </w:rPr>
-        <w:t>concern_details</w:t>
+        <w:t>action_taken</w:t>
       </w:r>
       <w:proofErr w:type="spellEnd"/>
       <w:r>
@@ -412,93 +508,7 @@
           <w:color w:val="193989"/>
           <w:u w:val="single"/>
         </w:rPr>
-        <w:t>}</w:t>
-      </w:r>
-    </w:p>
-    <w:p>
-      <w:pPr>
-        <w:spacing w:line="360" w:lineRule="auto"/>
-        <w:ind w:left="0" w:right="0"/>
-        <w:rPr>
-          <w:rFonts w:ascii="Lexend" w:eastAsia="Lexend" w:hAnsi="Lexend" w:cs="Lexend"/>
-          <w:color w:val="193989"/>
-        </w:rPr>
-      </w:pPr>
-    </w:p>
-    <w:p>
-      <w:pPr>
-        <w:spacing w:line="360" w:lineRule="auto"/>
-        <w:ind w:left="0" w:right="0"/>
-        <w:rPr>
-          <w:rFonts w:ascii="Lexend" w:eastAsia="Lexend" w:hAnsi="Lexend" w:cs="Lexend"/>
-          <w:b/>
-          <w:bCs/>
-          <w:color w:val="193989"/>
-        </w:rPr>
-      </w:pPr>
-      <w:r>
-        <w:rPr>
-          <w:rFonts w:ascii="Lexend" w:eastAsia="Lexend" w:hAnsi="Lexend" w:cs="Lexend"/>
-          <w:b/>
-          <w:bCs/>
-          <w:color w:val="193989"/>
-        </w:rPr>
-        <w:t xml:space="preserve">Action Taken:  </w:t>
-      </w:r>
-    </w:p>
-    <w:p>
-      <w:pPr>
-        <w:ind w:left="0" w:right="0"/>
-        <w:rPr>
-          <w:rFonts w:ascii="Lexend" w:eastAsia="Lexend" w:hAnsi="Lexend" w:cs="Lexend"/>
-          <w:b/>
-          <w:bCs/>
-          <w:color w:val="193989"/>
-        </w:rPr>
-      </w:pPr>
-    </w:p>
-    <w:p>
-      <w:pPr>
-        <w:ind w:left="0" w:right="0"/>
-        <w:rPr>
-          <w:rFonts w:ascii="Lexend" w:eastAsia="Lexend" w:hAnsi="Lexend" w:cs="Lexend"/>
-          <w:color w:val="193989"/>
-          <w:u w:val="single"/>
-        </w:rPr>
-      </w:pPr>
-      <w:r>
-        <w:rPr>
-          <w:rFonts w:ascii="Lexend" w:eastAsia="Lexend" w:hAnsi="Lexend" w:cs="Lexend"/>
-          <w:color w:val="193989"/>
-          <w:u w:val="single"/>
-        </w:rPr>
-        <w:t>${</w:t>
-      </w:r>
-      <w:proofErr w:type="spellStart"/>
-      <w:r>
-        <w:rPr>
-          <w:rFonts w:ascii="Lexend" w:eastAsia="Lexend" w:hAnsi="Lexend" w:cs="Lexend"/>
-          <w:color w:val="193989"/>
-          <w:u w:val="single"/>
-        </w:rPr>
-        <w:t>action_taken</w:t>
-      </w:r>
-      <w:proofErr w:type="spellEnd"/>
-      <w:r>
-        <w:rPr>
-          <w:rFonts w:ascii="Lexend" w:eastAsia="Lexend" w:hAnsi="Lexend" w:cs="Lexend"/>
-          <w:color w:val="193989"/>
-          <w:u w:val="single"/>
-        </w:rPr>
-        <w:t>}</w:t>
-      </w:r>
-      <w:r>
-        <w:rPr>
-          <w:rFonts w:ascii="Lexend" w:eastAsia="Lexend" w:hAnsi="Lexend" w:cs="Lexend"/>
-          <w:color w:val="193989"/>
-          <w:u w:val="single"/>
-        </w:rPr>
-        <w:t xml:space="preserve"> </w:t>
+        <w:t xml:space="preserve">} </w:t>
       </w:r>
     </w:p>
     <w:p>
@@ -551,103 +561,112 @@
           <w:sz w:val="18"/>
           <w:szCs w:val="18"/>
         </w:rPr>
-        <w:t>These are the things that the Technical person will ask the branch / department to monitor to prevent this concern from occurring again.</w:t>
-      </w:r>
-      <w:r>
-        <w:rPr>
-          <w:rFonts w:ascii="Lexend" w:eastAsia="Lexend" w:hAnsi="Lexend" w:cs="Lexend"/>
-          <w:color w:val="193989"/>
-        </w:rPr>
-        <w:t xml:space="preserve"> </w:t>
-      </w:r>
-    </w:p>
-    <w:p>
-      <w:pPr>
-        <w:spacing w:line="480" w:lineRule="auto"/>
-        <w:ind w:left="0" w:right="0"/>
-        <w:rPr>
-          <w:rFonts w:ascii="Lexend" w:eastAsia="Lexend" w:hAnsi="Lexend" w:cs="Lexend"/>
-          <w:b/>
-          <w:bCs/>
-          <w:color w:val="193989"/>
-        </w:rPr>
-      </w:pPr>
-    </w:p>
-    <w:p>
-      <w:pPr>
-        <w:ind w:left="0" w:right="0"/>
-        <w:jc w:val="center"/>
-        <w:rPr>
-          <w:rFonts w:ascii="Lexend" w:eastAsia="Lexend" w:hAnsi="Lexend" w:cs="Lexend"/>
-          <w:color w:val="193989"/>
-          <w:u w:val="single"/>
-        </w:rPr>
-      </w:pPr>
-      <w:r>
-        <w:rPr>
-          <w:rFonts w:ascii="Lexend" w:eastAsia="Lexend" w:hAnsi="Lexend" w:cs="Lexend"/>
-          <w:color w:val="193989"/>
-          <w:u w:val="single"/>
-        </w:rPr>
-        <w:t>${</w:t>
-      </w:r>
-      <w:r>
-        <w:rPr>
-          <w:rFonts w:ascii="Lexend" w:eastAsia="Lexend" w:hAnsi="Lexend" w:cs="Lexend"/>
-          <w:color w:val="193989"/>
-          <w:u w:val="single"/>
-        </w:rPr>
-        <w:t>result</w:t>
-      </w:r>
-      <w:r>
-        <w:rPr>
-          <w:rFonts w:ascii="Lexend" w:eastAsia="Lexend" w:hAnsi="Lexend" w:cs="Lexend"/>
-          <w:color w:val="193989"/>
-          <w:u w:val="single"/>
-        </w:rPr>
-        <w:t>}</w:t>
-      </w:r>
-    </w:p>
-    <w:p>
-      <w:pPr>
-        <w:ind w:left="0" w:right="0"/>
-        <w:jc w:val="center"/>
-        <w:rPr>
-          <w:rFonts w:ascii="Lexend" w:eastAsia="Lexend" w:hAnsi="Lexend" w:cs="Lexend"/>
-          <w:color w:val="193989"/>
-        </w:rPr>
-      </w:pPr>
-      <w:r>
-        <w:rPr>
-          <w:rFonts w:ascii="Lexend" w:eastAsia="Lexend" w:hAnsi="Lexend" w:cs="Lexend"/>
-          <w:color w:val="193989"/>
-        </w:rPr>
-        <w:t xml:space="preserve"> </w:t>
-      </w:r>
-    </w:p>
-    <w:p>
-      <w:pPr>
-        <w:ind w:left="0" w:right="0"/>
-        <w:rPr>
-          <w:rFonts w:ascii="Lexend" w:eastAsia="Lexend" w:hAnsi="Lexend" w:cs="Lexend"/>
-          <w:b/>
-          <w:bCs/>
-          <w:color w:val="193989"/>
-        </w:rPr>
-      </w:pPr>
-    </w:p>
-    <w:p>
-      <w:pPr>
-        <w:ind w:left="0" w:right="0"/>
+        <w:t xml:space="preserve">These are the things that the </w:t>
+      </w:r>
+      <w:proofErr w:type="gramStart"/>
+      <w:r>
         <w:rPr>
           <w:rFonts w:ascii="Lexend" w:eastAsia="Lexend" w:hAnsi="Lexend" w:cs="Lexend"/>
           <w:i/>
           <w:iCs/>
           <w:color w:val="193989"/>
+          <w:sz w:val="18"/>
+          <w:szCs w:val="18"/>
+        </w:rPr>
+        <w:t>Technical</w:t>
+      </w:r>
+      <w:proofErr w:type="gramEnd"/>
+      <w:r>
+        <w:rPr>
+          <w:rFonts w:ascii="Lexend" w:eastAsia="Lexend" w:hAnsi="Lexend" w:cs="Lexend"/>
+          <w:i/>
+          <w:iCs/>
+          <w:color w:val="193989"/>
+          <w:sz w:val="18"/>
+          <w:szCs w:val="18"/>
+        </w:rPr>
+        <w:t xml:space="preserve"> person will ask the branch / department to monitor to prevent this concern from occurring again.</w:t>
+      </w:r>
+      <w:r>
+        <w:rPr>
+          <w:rFonts w:ascii="Lexend" w:eastAsia="Lexend" w:hAnsi="Lexend" w:cs="Lexend"/>
+          <w:color w:val="193989"/>
+        </w:rPr>
+        <w:t xml:space="preserve"> </w:t>
+      </w:r>
+    </w:p>
+    <w:p>
+      <w:pPr>
+        <w:spacing w:line="480" w:lineRule="auto"/>
+        <w:ind w:left="0" w:right="0"/>
+        <w:rPr>
+          <w:rFonts w:ascii="Lexend" w:eastAsia="Lexend" w:hAnsi="Lexend" w:cs="Lexend"/>
+          <w:b/>
+          <w:bCs/>
+          <w:color w:val="193989"/>
+        </w:rPr>
+      </w:pPr>
+    </w:p>
+    <w:p>
+      <w:pPr>
+        <w:ind w:left="0" w:right="0"/>
+        <w:jc w:val="center"/>
+        <w:rPr>
+          <w:rFonts w:ascii="Lexend" w:eastAsia="Lexend" w:hAnsi="Lexend" w:cs="Lexend"/>
+          <w:color w:val="193989"/>
+          <w:u w:val="single"/>
+        </w:rPr>
+      </w:pPr>
+      <w:r>
+        <w:rPr>
+          <w:rFonts w:ascii="Lexend" w:eastAsia="Lexend" w:hAnsi="Lexend" w:cs="Lexend"/>
+          <w:color w:val="193989"/>
+          <w:u w:val="single"/>
+        </w:rPr>
+        <w:t>${result}</w:t>
+      </w:r>
+    </w:p>
+    <w:p>
+      <w:pPr>
+        <w:ind w:left="0" w:right="0"/>
+        <w:jc w:val="center"/>
+        <w:rPr>
+          <w:rFonts w:ascii="Lexend" w:eastAsia="Lexend" w:hAnsi="Lexend" w:cs="Lexend"/>
+          <w:color w:val="193989"/>
+        </w:rPr>
+      </w:pPr>
+      <w:r>
+        <w:rPr>
+          <w:rFonts w:ascii="Lexend" w:eastAsia="Lexend" w:hAnsi="Lexend" w:cs="Lexend"/>
+          <w:color w:val="193989"/>
+        </w:rPr>
+        <w:t xml:space="preserve"> </w:t>
+      </w:r>
+    </w:p>
+    <w:p>
+      <w:pPr>
+        <w:ind w:left="0" w:right="0"/>
+        <w:rPr>
+          <w:rFonts w:ascii="Lexend" w:eastAsia="Lexend" w:hAnsi="Lexend" w:cs="Lexend"/>
+          <w:b/>
+          <w:bCs/>
+          <w:color w:val="193989"/>
+        </w:rPr>
+      </w:pPr>
+    </w:p>
+    <w:p>
+      <w:pPr>
+        <w:ind w:left="0" w:right="0"/>
+        <w:rPr>
+          <w:rFonts w:ascii="Lexend" w:eastAsia="Lexend" w:hAnsi="Lexend" w:cs="Lexend"/>
+          <w:i/>
+          <w:iCs/>
+          <w:color w:val="193989"/>
           <w:sz w:val="20"/>
           <w:szCs w:val="20"/>
         </w:rPr>
       </w:pPr>
+      <w:proofErr w:type="gramStart"/>
       <w:r>
         <w:rPr>
           <w:rFonts w:ascii="Lexend" w:eastAsia="Lexend" w:hAnsi="Lexend" w:cs="Lexend"/>
@@ -657,7 +676,19 @@
           <w:sz w:val="20"/>
           <w:szCs w:val="20"/>
         </w:rPr>
-        <w:t xml:space="preserve">Note : </w:t>
+        <w:t>Note :</w:t>
+      </w:r>
+      <w:proofErr w:type="gramEnd"/>
+      <w:r>
+        <w:rPr>
+          <w:rFonts w:ascii="Lexend" w:eastAsia="Lexend" w:hAnsi="Lexend" w:cs="Lexend"/>
+          <w:b/>
+          <w:bCs/>
+          <w:color w:val="193989"/>
+          <w:sz w:val="20"/>
+          <w:szCs w:val="20"/>
+        </w:rPr>
+        <w:t xml:space="preserve"> </w:t>
       </w:r>
       <w:r>
         <w:rPr>
@@ -741,7 +772,27 @@
                 <w:bCs/>
                 <w:color w:val="193989"/>
               </w:rPr>
-              <w:t xml:space="preserve">Acknowledge By : </w:t>
+              <w:t xml:space="preserve">Acknowledge </w:t>
+            </w:r>
+            <w:proofErr w:type="gramStart"/>
+            <w:r>
+              <w:rPr>
+                <w:rFonts w:ascii="Lexend" w:eastAsia="Lexend" w:hAnsi="Lexend" w:cs="Lexend"/>
+                <w:b/>
+                <w:bCs/>
+                <w:color w:val="193989"/>
+              </w:rPr>
+              <w:t>By :</w:t>
+            </w:r>
+            <w:proofErr w:type="gramEnd"/>
+            <w:r>
+              <w:rPr>
+                <w:rFonts w:ascii="Lexend" w:eastAsia="Lexend" w:hAnsi="Lexend" w:cs="Lexend"/>
+                <w:b/>
+                <w:bCs/>
+                <w:color w:val="193989"/>
+              </w:rPr>
+              <w:t xml:space="preserve"> </w:t>
             </w:r>
           </w:p>
         </w:tc>
@@ -780,7 +831,27 @@
                 <w:bCs/>
                 <w:color w:val="193989"/>
               </w:rPr>
-              <w:t xml:space="preserve">Reported By : </w:t>
+              <w:t xml:space="preserve">Reported </w:t>
+            </w:r>
+            <w:proofErr w:type="gramStart"/>
+            <w:r>
+              <w:rPr>
+                <w:rFonts w:ascii="Lexend" w:eastAsia="Lexend" w:hAnsi="Lexend" w:cs="Lexend"/>
+                <w:b/>
+                <w:bCs/>
+                <w:color w:val="193989"/>
+              </w:rPr>
+              <w:t>By :</w:t>
+            </w:r>
+            <w:proofErr w:type="gramEnd"/>
+            <w:r>
+              <w:rPr>
+                <w:rFonts w:ascii="Lexend" w:eastAsia="Lexend" w:hAnsi="Lexend" w:cs="Lexend"/>
+                <w:b/>
+                <w:bCs/>
+                <w:color w:val="193989"/>
+              </w:rPr>
+              <w:t xml:space="preserve"> </w:t>
             </w:r>
           </w:p>
         </w:tc>
@@ -819,7 +890,27 @@
                 <w:bCs/>
                 <w:color w:val="193989"/>
               </w:rPr>
-              <w:t xml:space="preserve">Verified By : </w:t>
+              <w:t xml:space="preserve">Verified </w:t>
+            </w:r>
+            <w:proofErr w:type="gramStart"/>
+            <w:r>
+              <w:rPr>
+                <w:rFonts w:ascii="Lexend" w:eastAsia="Lexend" w:hAnsi="Lexend" w:cs="Lexend"/>
+                <w:b/>
+                <w:bCs/>
+                <w:color w:val="193989"/>
+              </w:rPr>
+              <w:t>By :</w:t>
+            </w:r>
+            <w:proofErr w:type="gramEnd"/>
+            <w:r>
+              <w:rPr>
+                <w:rFonts w:ascii="Lexend" w:eastAsia="Lexend" w:hAnsi="Lexend" w:cs="Lexend"/>
+                <w:b/>
+                <w:bCs/>
+                <w:color w:val="193989"/>
+              </w:rPr>
+              <w:t xml:space="preserve"> </w:t>
             </w:r>
           </w:p>
         </w:tc>
@@ -1054,7 +1145,7 @@
                 <w:bCs/>
                 <w:color w:val="193989"/>
               </w:rPr>
-              <w:t>Rose Anne S. Madla</w:t>
+              <w:t>Kenneth Dador</w:t>
             </w:r>
           </w:p>
           <w:p>
@@ -1078,7 +1169,7 @@
                 <w:rFonts w:ascii="Lexend" w:eastAsia="Lexend" w:hAnsi="Lexend" w:cs="Lexend"/>
                 <w:color w:val="193989"/>
               </w:rPr>
-              <w:t>Head, HRMD, IT &amp; Admin</w:t>
+              <w:t>IT Officer</w:t>
             </w:r>
           </w:p>
         </w:tc>
@@ -1900,7 +1991,6 @@
   <w:style w:type="character" w:default="1" w:styleId="DefaultParagraphFont">
     <w:name w:val="Default Paragraph Font"/>
     <w:uiPriority w:val="1"/>
-    <w:semiHidden/>
     <w:unhideWhenUsed/>
   </w:style>
   <w:style w:type="table" w:default="1" w:styleId="TableNormal">

</xml_diff>

<commit_message>
Implement AOM and OM workflow updates
</commit_message>
<xml_diff>
--- a/public/assets/generatePDF/template_technical.docx
+++ b/public/assets/generatePDF/template_technical.docx
@@ -77,27 +77,7 @@
           <w:bCs/>
           <w:color w:val="193989"/>
         </w:rPr>
-        <w:t>${</w:t>
-      </w:r>
-      <w:proofErr w:type="spellStart"/>
-      <w:r>
-        <w:rPr>
-          <w:rFonts w:ascii="Lexend" w:eastAsia="Lexend" w:hAnsi="Lexend" w:cs="Lexend"/>
-          <w:b/>
-          <w:bCs/>
-          <w:color w:val="193989"/>
-        </w:rPr>
-        <w:t>date_filed</w:t>
-      </w:r>
-      <w:proofErr w:type="spellEnd"/>
-      <w:r>
-        <w:rPr>
-          <w:rFonts w:ascii="Lexend" w:eastAsia="Lexend" w:hAnsi="Lexend" w:cs="Lexend"/>
-          <w:b/>
-          <w:bCs/>
-          <w:color w:val="193989"/>
-        </w:rPr>
-        <w:t>}</w:t>
+        <w:t>${date_filed}</w:t>
       </w:r>
     </w:p>
     <w:p>
@@ -134,23 +114,7 @@
           <w:rFonts w:ascii="Lexend" w:eastAsia="Lexend" w:hAnsi="Lexend" w:cs="Lexend"/>
           <w:color w:val="193989"/>
         </w:rPr>
-        <w:t>${</w:t>
-      </w:r>
-      <w:proofErr w:type="spellStart"/>
-      <w:r>
-        <w:rPr>
-          <w:rFonts w:ascii="Lexend" w:eastAsia="Lexend" w:hAnsi="Lexend" w:cs="Lexend"/>
-          <w:color w:val="193989"/>
-        </w:rPr>
-        <w:t>fullname</w:t>
-      </w:r>
-      <w:proofErr w:type="spellEnd"/>
-      <w:r>
-        <w:rPr>
-          <w:rFonts w:ascii="Lexend" w:eastAsia="Lexend" w:hAnsi="Lexend" w:cs="Lexend"/>
-          <w:color w:val="193989"/>
-        </w:rPr>
-        <w:t>}</w:t>
+        <w:t>${fullname}</w:t>
       </w:r>
       <w:r>
         <w:rPr>
@@ -159,7 +123,6 @@
         </w:rPr>
         <w:t xml:space="preserve">, under </w:t>
       </w:r>
-      <w:proofErr w:type="spellStart"/>
       <w:r>
         <w:rPr>
           <w:rFonts w:ascii="Lexend" w:eastAsia="Lexend" w:hAnsi="Lexend" w:cs="Lexend"/>
@@ -169,9 +132,8 @@
           <w:iCs/>
           <w:color w:val="193989"/>
         </w:rPr>
-        <w:t>StorageMart</w:t>
-      </w:r>
-      <w:proofErr w:type="spellEnd"/>
+        <w:t xml:space="preserve">StorageMart </w:t>
+      </w:r>
       <w:r>
         <w:rPr>
           <w:rFonts w:ascii="Lexend" w:eastAsia="Lexend" w:hAnsi="Lexend" w:cs="Lexend"/>
@@ -181,7 +143,7 @@
           <w:iCs/>
           <w:color w:val="193989"/>
         </w:rPr>
-        <w:t xml:space="preserve"> </w:t>
+        <w:t>${branchName}</w:t>
       </w:r>
       <w:r>
         <w:rPr>
@@ -192,481 +154,350 @@
           <w:iCs/>
           <w:color w:val="193989"/>
         </w:rPr>
+        <w:t xml:space="preserve"> Branch</w:t>
+      </w:r>
+      <w:r>
+        <w:rPr>
+          <w:rFonts w:ascii="Lexend" w:eastAsia="Lexend" w:hAnsi="Lexend" w:cs="Lexend"/>
+          <w:color w:val="193989"/>
+        </w:rPr>
+        <w:t xml:space="preserve"> hereby acknowledge that I have requested technical assistance which was assisted by </w:t>
+      </w:r>
+      <w:r>
+        <w:rPr>
+          <w:rFonts w:ascii="Lexend" w:eastAsia="Lexend" w:hAnsi="Lexend" w:cs="Lexend"/>
+          <w:b/>
+          <w:bCs/>
+          <w:color w:val="193989"/>
+        </w:rPr>
+        <w:t>${performedby}</w:t>
+      </w:r>
+      <w:r>
+        <w:rPr>
+          <w:rFonts w:ascii="Lexend" w:eastAsia="Lexend" w:hAnsi="Lexend" w:cs="Lexend"/>
+          <w:color w:val="193989"/>
+        </w:rPr>
+        <w:t xml:space="preserve">. This concern was classified under  </w:t>
+      </w:r>
+      <w:r>
+        <w:rPr>
+          <w:rFonts w:ascii="Lexend" w:eastAsia="Lexend" w:hAnsi="Lexend" w:cs="Lexend"/>
+          <w:b/>
+          <w:bCs/>
+          <w:color w:val="193989"/>
+        </w:rPr>
         <w:t>${</w:t>
       </w:r>
-      <w:proofErr w:type="spellStart"/>
-      <w:r>
-        <w:rPr>
-          <w:rFonts w:ascii="Lexend" w:eastAsia="Lexend" w:hAnsi="Lexend" w:cs="Lexend"/>
-          <w:b/>
-          <w:bCs/>
+      <w:r>
+        <w:rPr>
+          <w:rFonts w:ascii="Lexend" w:eastAsia="Lexend" w:hAnsi="Lexend" w:cs="Lexend"/>
+          <w:b/>
+          <w:bCs/>
+          <w:color w:val="193989"/>
+        </w:rPr>
+        <w:t>technical_purpose</w:t>
+      </w:r>
+      <w:r>
+        <w:rPr>
+          <w:rFonts w:ascii="Lexend" w:eastAsia="Lexend" w:hAnsi="Lexend" w:cs="Lexend"/>
+          <w:b/>
+          <w:bCs/>
+          <w:color w:val="193989"/>
+        </w:rPr>
+        <w:t>}</w:t>
+      </w:r>
+      <w:r>
+        <w:rPr>
+          <w:rFonts w:ascii="Lexend" w:eastAsia="Lexend" w:hAnsi="Lexend" w:cs="Lexend"/>
+          <w:color w:val="193989"/>
+        </w:rPr>
+        <w:t xml:space="preserve">. </w:t>
+      </w:r>
+    </w:p>
+    <w:p>
+      <w:pPr>
+        <w:spacing w:line="360" w:lineRule="auto"/>
+        <w:ind w:left="0" w:right="0"/>
+        <w:jc w:val="both"/>
+        <w:rPr>
+          <w:rFonts w:ascii="Lexend" w:eastAsia="Lexend" w:hAnsi="Lexend" w:cs="Lexend"/>
+          <w:color w:val="193989"/>
+        </w:rPr>
+      </w:pPr>
+    </w:p>
+    <w:p>
+      <w:pPr>
+        <w:spacing w:line="360" w:lineRule="auto"/>
+        <w:ind w:left="0" w:right="0"/>
+        <w:jc w:val="both"/>
+        <w:rPr>
+          <w:rFonts w:ascii="Lexend" w:eastAsia="Lexend" w:hAnsi="Lexend" w:cs="Lexend"/>
+          <w:color w:val="193989"/>
+        </w:rPr>
+      </w:pPr>
+      <w:r>
+        <w:rPr>
+          <w:rFonts w:ascii="Lexend" w:eastAsia="Lexend" w:hAnsi="Lexend" w:cs="Lexend"/>
+          <w:color w:val="193989"/>
+        </w:rPr>
+        <w:t>By signing this document, I acknowledge the actions taken by the IT team and waive any accountability for potential risks arising after the initial resolution. I also confirm that I have been fully informed of matters within my responsibility.</w:t>
+      </w:r>
+    </w:p>
+    <w:p>
+      <w:pPr>
+        <w:spacing w:line="360" w:lineRule="auto"/>
+        <w:ind w:left="0" w:right="0"/>
+        <w:rPr>
+          <w:rFonts w:ascii="Lexend" w:eastAsia="Lexend" w:hAnsi="Lexend" w:cs="Lexend"/>
+          <w:color w:val="193989"/>
+        </w:rPr>
+      </w:pPr>
+    </w:p>
+    <w:p>
+      <w:pPr>
+        <w:spacing w:line="360" w:lineRule="auto"/>
+        <w:ind w:left="0" w:right="0"/>
+        <w:rPr>
+          <w:rFonts w:ascii="Lexend" w:eastAsia="Lexend" w:hAnsi="Lexend" w:cs="Lexend"/>
+          <w:b/>
+          <w:bCs/>
+          <w:color w:val="193989"/>
+        </w:rPr>
+      </w:pPr>
+      <w:r>
+        <w:rPr>
+          <w:rFonts w:ascii="Lexend" w:eastAsia="Lexend" w:hAnsi="Lexend" w:cs="Lexend"/>
+          <w:b/>
+          <w:bCs/>
+          <w:color w:val="193989"/>
+        </w:rPr>
+        <w:t xml:space="preserve">Details of the Concern: </w:t>
+      </w:r>
+    </w:p>
+    <w:p>
+      <w:pPr>
+        <w:ind w:left="0" w:right="0"/>
+        <w:rPr>
+          <w:rFonts w:ascii="Lexend" w:eastAsia="Lexend" w:hAnsi="Lexend" w:cs="Lexend"/>
+          <w:color w:val="193989"/>
+        </w:rPr>
+      </w:pPr>
+    </w:p>
+    <w:p>
+      <w:pPr>
+        <w:ind w:left="0" w:right="0"/>
+        <w:jc w:val="center"/>
+        <w:rPr>
+          <w:rFonts w:ascii="Lexend" w:eastAsia="Lexend" w:hAnsi="Lexend" w:cs="Lexend"/>
+          <w:color w:val="193989"/>
+          <w:u w:val="single"/>
+        </w:rPr>
+      </w:pPr>
+      <w:r>
+        <w:rPr>
+          <w:rFonts w:ascii="Lexend" w:eastAsia="Lexend" w:hAnsi="Lexend" w:cs="Lexend"/>
+          <w:color w:val="193989"/>
+          <w:u w:val="single"/>
+        </w:rPr>
+        <w:t>${concern_details}</w:t>
+      </w:r>
+    </w:p>
+    <w:p>
+      <w:pPr>
+        <w:spacing w:line="360" w:lineRule="auto"/>
+        <w:ind w:left="0" w:right="0"/>
+        <w:rPr>
+          <w:rFonts w:ascii="Lexend" w:eastAsia="Lexend" w:hAnsi="Lexend" w:cs="Lexend"/>
+          <w:color w:val="193989"/>
+        </w:rPr>
+      </w:pPr>
+    </w:p>
+    <w:p>
+      <w:pPr>
+        <w:spacing w:line="360" w:lineRule="auto"/>
+        <w:ind w:left="0" w:right="0"/>
+        <w:rPr>
+          <w:rFonts w:ascii="Lexend" w:eastAsia="Lexend" w:hAnsi="Lexend" w:cs="Lexend"/>
+          <w:b/>
+          <w:bCs/>
+          <w:color w:val="193989"/>
+        </w:rPr>
+      </w:pPr>
+      <w:r>
+        <w:rPr>
+          <w:rFonts w:ascii="Lexend" w:eastAsia="Lexend" w:hAnsi="Lexend" w:cs="Lexend"/>
+          <w:b/>
+          <w:bCs/>
+          <w:color w:val="193989"/>
+        </w:rPr>
+        <w:t xml:space="preserve">Action Taken:  </w:t>
+      </w:r>
+    </w:p>
+    <w:p>
+      <w:pPr>
+        <w:ind w:left="0" w:right="0"/>
+        <w:rPr>
+          <w:rFonts w:ascii="Lexend" w:eastAsia="Lexend" w:hAnsi="Lexend" w:cs="Lexend"/>
+          <w:color w:val="193989"/>
+          <w:u w:val="single"/>
+        </w:rPr>
+      </w:pPr>
+      <w:r>
+        <w:rPr>
+          <w:rFonts w:ascii="Lexend" w:eastAsia="Lexend" w:hAnsi="Lexend" w:cs="Lexend"/>
+          <w:color w:val="193989"/>
+          <w:u w:val="single"/>
+        </w:rPr>
+        <w:t>${</w:t>
+      </w:r>
+      <w:r>
+        <w:rPr>
+          <w:rFonts w:ascii="Lexend" w:eastAsia="Lexend" w:hAnsi="Lexend" w:cs="Lexend"/>
+          <w:color w:val="193989"/>
+          <w:u w:val="single"/>
+        </w:rPr>
+        <w:t>action_taken</w:t>
+      </w:r>
+      <w:r>
+        <w:rPr>
+          <w:rFonts w:ascii="Lexend" w:eastAsia="Lexend" w:hAnsi="Lexend" w:cs="Lexend"/>
+          <w:color w:val="193989"/>
+          <w:u w:val="single"/>
+        </w:rPr>
+        <w:t xml:space="preserve">} </w:t>
+      </w:r>
+    </w:p>
+    <w:p>
+      <w:pPr>
+        <w:spacing w:line="360" w:lineRule="auto"/>
+        <w:ind w:left="0" w:right="0"/>
+        <w:rPr>
+          <w:rFonts w:ascii="Lexend" w:eastAsia="Lexend" w:hAnsi="Lexend" w:cs="Lexend"/>
+          <w:b/>
+          <w:bCs/>
+          <w:color w:val="193989"/>
+        </w:rPr>
+      </w:pPr>
+    </w:p>
+    <w:p>
+      <w:pPr>
+        <w:spacing w:line="360" w:lineRule="auto"/>
+        <w:ind w:left="0" w:right="0"/>
+        <w:rPr>
+          <w:rFonts w:ascii="Lexend" w:eastAsia="Lexend" w:hAnsi="Lexend" w:cs="Lexend"/>
+          <w:b/>
+          <w:bCs/>
+          <w:color w:val="193989"/>
+        </w:rPr>
+      </w:pPr>
+      <w:r>
+        <w:rPr>
+          <w:rFonts w:ascii="Lexend" w:eastAsia="Lexend" w:hAnsi="Lexend" w:cs="Lexend"/>
+          <w:b/>
+          <w:bCs/>
+          <w:color w:val="193989"/>
+        </w:rPr>
+        <w:t xml:space="preserve">Department / Branch Monitoring Guideline: </w:t>
+      </w:r>
+    </w:p>
+    <w:p>
+      <w:pPr>
+        <w:ind w:left="0" w:right="0"/>
+        <w:rPr>
+          <w:rFonts w:ascii="Lexend" w:eastAsia="Lexend" w:hAnsi="Lexend" w:cs="Lexend"/>
+          <w:color w:val="193989"/>
+        </w:rPr>
+      </w:pPr>
+      <w:r>
+        <w:rPr>
+          <w:rFonts w:ascii="Lexend" w:eastAsia="Lexend" w:hAnsi="Lexend" w:cs="Lexend"/>
           <w:i/>
           <w:iCs/>
           <w:color w:val="193989"/>
-        </w:rPr>
-        <w:t>branchName</w:t>
-      </w:r>
-      <w:proofErr w:type="spellEnd"/>
-      <w:r>
-        <w:rPr>
-          <w:rFonts w:ascii="Lexend" w:eastAsia="Lexend" w:hAnsi="Lexend" w:cs="Lexend"/>
-          <w:b/>
-          <w:bCs/>
+          <w:sz w:val="18"/>
+          <w:szCs w:val="18"/>
+        </w:rPr>
+        <w:t>These are the things that the Technical person will ask the branch / department to monitor to prevent this concern from occurring again.</w:t>
+      </w:r>
+      <w:r>
+        <w:rPr>
+          <w:rFonts w:ascii="Lexend" w:eastAsia="Lexend" w:hAnsi="Lexend" w:cs="Lexend"/>
+          <w:color w:val="193989"/>
+        </w:rPr>
+        <w:t xml:space="preserve"> </w:t>
+      </w:r>
+    </w:p>
+    <w:p>
+      <w:pPr>
+        <w:spacing w:line="480" w:lineRule="auto"/>
+        <w:ind w:left="0" w:right="0"/>
+        <w:rPr>
+          <w:rFonts w:ascii="Lexend" w:eastAsia="Lexend" w:hAnsi="Lexend" w:cs="Lexend"/>
+          <w:b/>
+          <w:bCs/>
+          <w:color w:val="193989"/>
+        </w:rPr>
+      </w:pPr>
+    </w:p>
+    <w:p>
+      <w:pPr>
+        <w:ind w:left="0" w:right="0"/>
+        <w:jc w:val="center"/>
+        <w:rPr>
+          <w:rFonts w:ascii="Lexend" w:eastAsia="Lexend" w:hAnsi="Lexend" w:cs="Lexend"/>
+          <w:color w:val="193989"/>
+          <w:u w:val="single"/>
+        </w:rPr>
+      </w:pPr>
+      <w:r>
+        <w:rPr>
+          <w:rFonts w:ascii="Lexend" w:eastAsia="Lexend" w:hAnsi="Lexend" w:cs="Lexend"/>
+          <w:color w:val="193989"/>
+          <w:u w:val="single"/>
+        </w:rPr>
+        <w:t>${result}</w:t>
+      </w:r>
+    </w:p>
+    <w:p>
+      <w:pPr>
+        <w:ind w:left="0" w:right="0"/>
+        <w:jc w:val="center"/>
+        <w:rPr>
+          <w:rFonts w:ascii="Lexend" w:eastAsia="Lexend" w:hAnsi="Lexend" w:cs="Lexend"/>
+          <w:color w:val="193989"/>
+        </w:rPr>
+      </w:pPr>
+      <w:r>
+        <w:rPr>
+          <w:rFonts w:ascii="Lexend" w:eastAsia="Lexend" w:hAnsi="Lexend" w:cs="Lexend"/>
+          <w:color w:val="193989"/>
+        </w:rPr>
+        <w:t xml:space="preserve"> </w:t>
+      </w:r>
+    </w:p>
+    <w:p>
+      <w:pPr>
+        <w:ind w:left="0" w:right="0"/>
+        <w:rPr>
+          <w:rFonts w:ascii="Lexend" w:eastAsia="Lexend" w:hAnsi="Lexend" w:cs="Lexend"/>
+          <w:b/>
+          <w:bCs/>
+          <w:color w:val="193989"/>
+        </w:rPr>
+      </w:pPr>
+    </w:p>
+    <w:p>
+      <w:pPr>
+        <w:ind w:left="0" w:right="0"/>
+        <w:rPr>
+          <w:rFonts w:ascii="Lexend" w:eastAsia="Lexend" w:hAnsi="Lexend" w:cs="Lexend"/>
           <w:i/>
           <w:iCs/>
           <w:color w:val="193989"/>
-        </w:rPr>
-        <w:t>}</w:t>
-      </w:r>
-      <w:r>
-        <w:rPr>
-          <w:rFonts w:ascii="Lexend" w:eastAsia="Lexend" w:hAnsi="Lexend" w:cs="Lexend"/>
-          <w:b/>
-          <w:bCs/>
-          <w:i/>
-          <w:iCs/>
-          <w:color w:val="193989"/>
-        </w:rPr>
-        <w:t xml:space="preserve"> Branch</w:t>
-      </w:r>
-      <w:r>
-        <w:rPr>
-          <w:rFonts w:ascii="Lexend" w:eastAsia="Lexend" w:hAnsi="Lexend" w:cs="Lexend"/>
-          <w:color w:val="193989"/>
-        </w:rPr>
-        <w:t xml:space="preserve"> hereby acknowledge that I have requested technical assistance which was assisted by </w:t>
-      </w:r>
-      <w:r>
-        <w:rPr>
-          <w:rFonts w:ascii="Lexend" w:eastAsia="Lexend" w:hAnsi="Lexend" w:cs="Lexend"/>
-          <w:b/>
-          <w:bCs/>
-          <w:color w:val="193989"/>
-        </w:rPr>
-        <w:t>${</w:t>
-      </w:r>
-      <w:proofErr w:type="spellStart"/>
-      <w:r>
-        <w:rPr>
-          <w:rFonts w:ascii="Lexend" w:eastAsia="Lexend" w:hAnsi="Lexend" w:cs="Lexend"/>
-          <w:b/>
-          <w:bCs/>
-          <w:color w:val="193989"/>
-        </w:rPr>
-        <w:t>performedby</w:t>
-      </w:r>
-      <w:proofErr w:type="spellEnd"/>
-      <w:r>
-        <w:rPr>
-          <w:rFonts w:ascii="Lexend" w:eastAsia="Lexend" w:hAnsi="Lexend" w:cs="Lexend"/>
-          <w:b/>
-          <w:bCs/>
-          <w:color w:val="193989"/>
-        </w:rPr>
-        <w:t>}</w:t>
-      </w:r>
-      <w:r>
-        <w:rPr>
-          <w:rFonts w:ascii="Lexend" w:eastAsia="Lexend" w:hAnsi="Lexend" w:cs="Lexend"/>
-          <w:color w:val="193989"/>
-        </w:rPr>
-        <w:t xml:space="preserve">. This concern was classified </w:t>
-      </w:r>
-      <w:proofErr w:type="gramStart"/>
-      <w:r>
-        <w:rPr>
-          <w:rFonts w:ascii="Lexend" w:eastAsia="Lexend" w:hAnsi="Lexend" w:cs="Lexend"/>
-          <w:color w:val="193989"/>
-        </w:rPr>
-        <w:t xml:space="preserve">under  </w:t>
-      </w:r>
-      <w:r>
-        <w:rPr>
-          <w:rFonts w:ascii="Lexend" w:eastAsia="Lexend" w:hAnsi="Lexend" w:cs="Lexend"/>
-          <w:b/>
-          <w:bCs/>
-          <w:color w:val="193989"/>
-        </w:rPr>
-        <w:t>$</w:t>
-      </w:r>
-      <w:proofErr w:type="gramEnd"/>
-      <w:r>
-        <w:rPr>
-          <w:rFonts w:ascii="Lexend" w:eastAsia="Lexend" w:hAnsi="Lexend" w:cs="Lexend"/>
-          <w:b/>
-          <w:bCs/>
-          <w:color w:val="193989"/>
-        </w:rPr>
-        <w:t>{</w:t>
-      </w:r>
-      <w:proofErr w:type="spellStart"/>
-      <w:r>
-        <w:rPr>
-          <w:rFonts w:ascii="Lexend" w:eastAsia="Lexend" w:hAnsi="Lexend" w:cs="Lexend"/>
-          <w:b/>
-          <w:bCs/>
-          <w:color w:val="193989"/>
-        </w:rPr>
-        <w:t>technical_purpose</w:t>
-      </w:r>
-      <w:proofErr w:type="spellEnd"/>
-      <w:r>
-        <w:rPr>
-          <w:rFonts w:ascii="Lexend" w:eastAsia="Lexend" w:hAnsi="Lexend" w:cs="Lexend"/>
-          <w:b/>
-          <w:bCs/>
-          <w:color w:val="193989"/>
-        </w:rPr>
-        <w:t>}</w:t>
-      </w:r>
-      <w:r>
-        <w:rPr>
-          <w:rFonts w:ascii="Lexend" w:eastAsia="Lexend" w:hAnsi="Lexend" w:cs="Lexend"/>
-          <w:color w:val="193989"/>
-        </w:rPr>
-        <w:t xml:space="preserve">. </w:t>
-      </w:r>
-    </w:p>
-    <w:p>
-      <w:pPr>
-        <w:spacing w:line="360" w:lineRule="auto"/>
-        <w:ind w:left="0" w:right="0"/>
-        <w:jc w:val="both"/>
-        <w:rPr>
-          <w:rFonts w:ascii="Lexend" w:eastAsia="Lexend" w:hAnsi="Lexend" w:cs="Lexend"/>
-          <w:color w:val="193989"/>
-        </w:rPr>
-      </w:pPr>
-    </w:p>
-    <w:p>
-      <w:pPr>
-        <w:spacing w:line="360" w:lineRule="auto"/>
-        <w:ind w:left="0" w:right="0"/>
-        <w:jc w:val="both"/>
-        <w:rPr>
-          <w:rFonts w:ascii="Lexend" w:eastAsia="Lexend" w:hAnsi="Lexend" w:cs="Lexend"/>
-          <w:color w:val="193989"/>
-        </w:rPr>
-      </w:pPr>
-      <w:r>
-        <w:rPr>
-          <w:rFonts w:ascii="Lexend" w:eastAsia="Lexend" w:hAnsi="Lexend" w:cs="Lexend"/>
-          <w:color w:val="193989"/>
-        </w:rPr>
-        <w:t>By signing this document, I acknowledge the actions taken by the IT team and waive any accountability for potential risks arising after the initial resolution. I also confirm that I have been fully informed of matters within my responsibility.</w:t>
-      </w:r>
-    </w:p>
-    <w:p>
-      <w:pPr>
-        <w:spacing w:line="360" w:lineRule="auto"/>
-        <w:ind w:left="0" w:right="0"/>
-        <w:rPr>
-          <w:rFonts w:ascii="Lexend" w:eastAsia="Lexend" w:hAnsi="Lexend" w:cs="Lexend"/>
-          <w:color w:val="193989"/>
-        </w:rPr>
-      </w:pPr>
-    </w:p>
-    <w:p>
-      <w:pPr>
-        <w:spacing w:line="360" w:lineRule="auto"/>
-        <w:ind w:left="0" w:right="0"/>
-        <w:rPr>
-          <w:rFonts w:ascii="Lexend" w:eastAsia="Lexend" w:hAnsi="Lexend" w:cs="Lexend"/>
-          <w:b/>
-          <w:bCs/>
-          <w:color w:val="193989"/>
-        </w:rPr>
-      </w:pPr>
-      <w:r>
-        <w:rPr>
-          <w:rFonts w:ascii="Lexend" w:eastAsia="Lexend" w:hAnsi="Lexend" w:cs="Lexend"/>
-          <w:b/>
-          <w:bCs/>
-          <w:color w:val="193989"/>
-        </w:rPr>
-        <w:t xml:space="preserve">Details of the Concern: </w:t>
-      </w:r>
-    </w:p>
-    <w:p>
-      <w:pPr>
-        <w:ind w:left="0" w:right="0"/>
-        <w:rPr>
-          <w:rFonts w:ascii="Lexend" w:eastAsia="Lexend" w:hAnsi="Lexend" w:cs="Lexend"/>
-          <w:color w:val="193989"/>
-        </w:rPr>
-      </w:pPr>
-    </w:p>
-    <w:p>
-      <w:pPr>
-        <w:ind w:left="0" w:right="0"/>
-        <w:jc w:val="center"/>
-        <w:rPr>
-          <w:rFonts w:ascii="Lexend" w:eastAsia="Lexend" w:hAnsi="Lexend" w:cs="Lexend"/>
-          <w:color w:val="193989"/>
-          <w:u w:val="single"/>
-        </w:rPr>
-      </w:pPr>
-      <w:r>
-        <w:rPr>
-          <w:rFonts w:ascii="Lexend" w:eastAsia="Lexend" w:hAnsi="Lexend" w:cs="Lexend"/>
-          <w:color w:val="193989"/>
-          <w:u w:val="single"/>
-        </w:rPr>
-        <w:t>${</w:t>
-      </w:r>
-      <w:proofErr w:type="spellStart"/>
-      <w:r>
-        <w:rPr>
-          <w:rFonts w:ascii="Lexend" w:eastAsia="Lexend" w:hAnsi="Lexend" w:cs="Lexend"/>
-          <w:color w:val="193989"/>
-          <w:u w:val="single"/>
-        </w:rPr>
-        <w:t>concern_details</w:t>
-      </w:r>
-      <w:proofErr w:type="spellEnd"/>
-      <w:r>
-        <w:rPr>
-          <w:rFonts w:ascii="Lexend" w:eastAsia="Lexend" w:hAnsi="Lexend" w:cs="Lexend"/>
-          <w:color w:val="193989"/>
-          <w:u w:val="single"/>
-        </w:rPr>
-        <w:t>}</w:t>
-      </w:r>
-    </w:p>
-    <w:p>
-      <w:pPr>
-        <w:spacing w:line="360" w:lineRule="auto"/>
-        <w:ind w:left="0" w:right="0"/>
-        <w:rPr>
-          <w:rFonts w:ascii="Lexend" w:eastAsia="Lexend" w:hAnsi="Lexend" w:cs="Lexend"/>
-          <w:color w:val="193989"/>
-        </w:rPr>
-      </w:pPr>
-    </w:p>
-    <w:p>
-      <w:pPr>
-        <w:spacing w:line="360" w:lineRule="auto"/>
-        <w:ind w:left="0" w:right="0"/>
-        <w:rPr>
-          <w:rFonts w:ascii="Lexend" w:eastAsia="Lexend" w:hAnsi="Lexend" w:cs="Lexend"/>
-          <w:b/>
-          <w:bCs/>
-          <w:color w:val="193989"/>
-        </w:rPr>
-      </w:pPr>
-      <w:r>
-        <w:rPr>
-          <w:rFonts w:ascii="Lexend" w:eastAsia="Lexend" w:hAnsi="Lexend" w:cs="Lexend"/>
-          <w:b/>
-          <w:bCs/>
-          <w:color w:val="193989"/>
-        </w:rPr>
-        <w:t xml:space="preserve">Action Taken:  </w:t>
-      </w:r>
-    </w:p>
-    <w:p>
-      <w:pPr>
-        <w:ind w:left="0" w:right="0"/>
-        <w:rPr>
-          <w:rFonts w:ascii="Lexend" w:eastAsia="Lexend" w:hAnsi="Lexend" w:cs="Lexend"/>
-          <w:b/>
-          <w:bCs/>
-          <w:color w:val="193989"/>
-        </w:rPr>
-      </w:pPr>
-    </w:p>
-    <w:p>
-      <w:pPr>
-        <w:ind w:left="0" w:right="0"/>
-        <w:rPr>
-          <w:rFonts w:ascii="Lexend" w:eastAsia="Lexend" w:hAnsi="Lexend" w:cs="Lexend"/>
-          <w:color w:val="193989"/>
-          <w:u w:val="single"/>
-        </w:rPr>
-      </w:pPr>
-      <w:r>
-        <w:rPr>
-          <w:rFonts w:ascii="Lexend" w:eastAsia="Lexend" w:hAnsi="Lexend" w:cs="Lexend"/>
-          <w:color w:val="193989"/>
-          <w:u w:val="single"/>
-        </w:rPr>
-        <w:t>${</w:t>
-      </w:r>
-      <w:proofErr w:type="spellStart"/>
-      <w:r>
-        <w:rPr>
-          <w:rFonts w:ascii="Lexend" w:eastAsia="Lexend" w:hAnsi="Lexend" w:cs="Lexend"/>
-          <w:color w:val="193989"/>
-          <w:u w:val="single"/>
-        </w:rPr>
-        <w:t>action_taken</w:t>
-      </w:r>
-      <w:proofErr w:type="spellEnd"/>
-      <w:r>
-        <w:rPr>
-          <w:rFonts w:ascii="Lexend" w:eastAsia="Lexend" w:hAnsi="Lexend" w:cs="Lexend"/>
-          <w:color w:val="193989"/>
-          <w:u w:val="single"/>
-        </w:rPr>
-        <w:t xml:space="preserve">} </w:t>
-      </w:r>
-    </w:p>
-    <w:p>
-      <w:pPr>
-        <w:spacing w:line="360" w:lineRule="auto"/>
-        <w:ind w:left="0" w:right="0"/>
-        <w:rPr>
-          <w:rFonts w:ascii="Lexend" w:eastAsia="Lexend" w:hAnsi="Lexend" w:cs="Lexend"/>
-          <w:b/>
-          <w:bCs/>
-          <w:color w:val="193989"/>
-        </w:rPr>
-      </w:pPr>
-    </w:p>
-    <w:p>
-      <w:pPr>
-        <w:spacing w:line="360" w:lineRule="auto"/>
-        <w:ind w:left="0" w:right="0"/>
-        <w:rPr>
-          <w:rFonts w:ascii="Lexend" w:eastAsia="Lexend" w:hAnsi="Lexend" w:cs="Lexend"/>
-          <w:b/>
-          <w:bCs/>
-          <w:color w:val="193989"/>
-        </w:rPr>
-      </w:pPr>
-      <w:r>
-        <w:rPr>
-          <w:rFonts w:ascii="Lexend" w:eastAsia="Lexend" w:hAnsi="Lexend" w:cs="Lexend"/>
-          <w:b/>
-          <w:bCs/>
-          <w:color w:val="193989"/>
-        </w:rPr>
-        <w:t xml:space="preserve">Department / Branch Monitoring Guideline: </w:t>
-      </w:r>
-    </w:p>
-    <w:p>
-      <w:pPr>
-        <w:ind w:left="0" w:right="0"/>
-        <w:rPr>
-          <w:rFonts w:ascii="Lexend" w:eastAsia="Lexend" w:hAnsi="Lexend" w:cs="Lexend"/>
-          <w:color w:val="193989"/>
-        </w:rPr>
-      </w:pPr>
-      <w:r>
-        <w:rPr>
-          <w:rFonts w:ascii="Lexend" w:eastAsia="Lexend" w:hAnsi="Lexend" w:cs="Lexend"/>
-          <w:i/>
-          <w:iCs/>
-          <w:color w:val="193989"/>
-          <w:sz w:val="18"/>
-          <w:szCs w:val="18"/>
-        </w:rPr>
-        <w:t xml:space="preserve">These are the things that the </w:t>
-      </w:r>
-      <w:proofErr w:type="gramStart"/>
-      <w:r>
-        <w:rPr>
-          <w:rFonts w:ascii="Lexend" w:eastAsia="Lexend" w:hAnsi="Lexend" w:cs="Lexend"/>
-          <w:i/>
-          <w:iCs/>
-          <w:color w:val="193989"/>
-          <w:sz w:val="18"/>
-          <w:szCs w:val="18"/>
-        </w:rPr>
-        <w:t>Technical</w:t>
-      </w:r>
-      <w:proofErr w:type="gramEnd"/>
-      <w:r>
-        <w:rPr>
-          <w:rFonts w:ascii="Lexend" w:eastAsia="Lexend" w:hAnsi="Lexend" w:cs="Lexend"/>
-          <w:i/>
-          <w:iCs/>
-          <w:color w:val="193989"/>
-          <w:sz w:val="18"/>
-          <w:szCs w:val="18"/>
-        </w:rPr>
-        <w:t xml:space="preserve"> person will ask the branch / department to monitor to prevent this concern from occurring again.</w:t>
-      </w:r>
-      <w:r>
-        <w:rPr>
-          <w:rFonts w:ascii="Lexend" w:eastAsia="Lexend" w:hAnsi="Lexend" w:cs="Lexend"/>
-          <w:color w:val="193989"/>
-        </w:rPr>
-        <w:t xml:space="preserve"> </w:t>
-      </w:r>
-    </w:p>
-    <w:p>
-      <w:pPr>
-        <w:spacing w:line="480" w:lineRule="auto"/>
-        <w:ind w:left="0" w:right="0"/>
-        <w:rPr>
-          <w:rFonts w:ascii="Lexend" w:eastAsia="Lexend" w:hAnsi="Lexend" w:cs="Lexend"/>
-          <w:b/>
-          <w:bCs/>
-          <w:color w:val="193989"/>
-        </w:rPr>
-      </w:pPr>
-    </w:p>
-    <w:p>
-      <w:pPr>
-        <w:ind w:left="0" w:right="0"/>
-        <w:jc w:val="center"/>
-        <w:rPr>
-          <w:rFonts w:ascii="Lexend" w:eastAsia="Lexend" w:hAnsi="Lexend" w:cs="Lexend"/>
-          <w:color w:val="193989"/>
-          <w:u w:val="single"/>
-        </w:rPr>
-      </w:pPr>
-      <w:r>
-        <w:rPr>
-          <w:rFonts w:ascii="Lexend" w:eastAsia="Lexend" w:hAnsi="Lexend" w:cs="Lexend"/>
-          <w:color w:val="193989"/>
-          <w:u w:val="single"/>
-        </w:rPr>
-        <w:t>${result}</w:t>
-      </w:r>
-    </w:p>
-    <w:p>
-      <w:pPr>
-        <w:ind w:left="0" w:right="0"/>
-        <w:jc w:val="center"/>
-        <w:rPr>
-          <w:rFonts w:ascii="Lexend" w:eastAsia="Lexend" w:hAnsi="Lexend" w:cs="Lexend"/>
-          <w:color w:val="193989"/>
-        </w:rPr>
-      </w:pPr>
-      <w:r>
-        <w:rPr>
-          <w:rFonts w:ascii="Lexend" w:eastAsia="Lexend" w:hAnsi="Lexend" w:cs="Lexend"/>
-          <w:color w:val="193989"/>
-        </w:rPr>
-        <w:t xml:space="preserve"> </w:t>
-      </w:r>
-    </w:p>
-    <w:p>
-      <w:pPr>
-        <w:ind w:left="0" w:right="0"/>
-        <w:rPr>
-          <w:rFonts w:ascii="Lexend" w:eastAsia="Lexend" w:hAnsi="Lexend" w:cs="Lexend"/>
-          <w:b/>
-          <w:bCs/>
-          <w:color w:val="193989"/>
-        </w:rPr>
-      </w:pPr>
-    </w:p>
-    <w:p>
-      <w:pPr>
-        <w:ind w:left="0" w:right="0"/>
-        <w:rPr>
-          <w:rFonts w:ascii="Lexend" w:eastAsia="Lexend" w:hAnsi="Lexend" w:cs="Lexend"/>
-          <w:i/>
-          <w:iCs/>
-          <w:color w:val="193989"/>
           <w:sz w:val="20"/>
           <w:szCs w:val="20"/>
         </w:rPr>
       </w:pPr>
-      <w:proofErr w:type="gramStart"/>
       <w:r>
         <w:rPr>
           <w:rFonts w:ascii="Lexend" w:eastAsia="Lexend" w:hAnsi="Lexend" w:cs="Lexend"/>
@@ -676,19 +507,7 @@
           <w:sz w:val="20"/>
           <w:szCs w:val="20"/>
         </w:rPr>
-        <w:t>Note :</w:t>
-      </w:r>
-      <w:proofErr w:type="gramEnd"/>
-      <w:r>
-        <w:rPr>
-          <w:rFonts w:ascii="Lexend" w:eastAsia="Lexend" w:hAnsi="Lexend" w:cs="Lexend"/>
-          <w:b/>
-          <w:bCs/>
-          <w:color w:val="193989"/>
-          <w:sz w:val="20"/>
-          <w:szCs w:val="20"/>
-        </w:rPr>
-        <w:t xml:space="preserve"> </w:t>
+        <w:t xml:space="preserve">Note : </w:t>
       </w:r>
       <w:r>
         <w:rPr>
@@ -772,27 +591,7 @@
                 <w:bCs/>
                 <w:color w:val="193989"/>
               </w:rPr>
-              <w:t xml:space="preserve">Acknowledge </w:t>
-            </w:r>
-            <w:proofErr w:type="gramStart"/>
-            <w:r>
-              <w:rPr>
-                <w:rFonts w:ascii="Lexend" w:eastAsia="Lexend" w:hAnsi="Lexend" w:cs="Lexend"/>
-                <w:b/>
-                <w:bCs/>
-                <w:color w:val="193989"/>
-              </w:rPr>
-              <w:t>By :</w:t>
-            </w:r>
-            <w:proofErr w:type="gramEnd"/>
-            <w:r>
-              <w:rPr>
-                <w:rFonts w:ascii="Lexend" w:eastAsia="Lexend" w:hAnsi="Lexend" w:cs="Lexend"/>
-                <w:b/>
-                <w:bCs/>
-                <w:color w:val="193989"/>
-              </w:rPr>
-              <w:t xml:space="preserve"> </w:t>
+              <w:t xml:space="preserve">Acknowledge By : </w:t>
             </w:r>
           </w:p>
         </w:tc>
@@ -831,27 +630,7 @@
                 <w:bCs/>
                 <w:color w:val="193989"/>
               </w:rPr>
-              <w:t xml:space="preserve">Reported </w:t>
-            </w:r>
-            <w:proofErr w:type="gramStart"/>
-            <w:r>
-              <w:rPr>
-                <w:rFonts w:ascii="Lexend" w:eastAsia="Lexend" w:hAnsi="Lexend" w:cs="Lexend"/>
-                <w:b/>
-                <w:bCs/>
-                <w:color w:val="193989"/>
-              </w:rPr>
-              <w:t>By :</w:t>
-            </w:r>
-            <w:proofErr w:type="gramEnd"/>
-            <w:r>
-              <w:rPr>
-                <w:rFonts w:ascii="Lexend" w:eastAsia="Lexend" w:hAnsi="Lexend" w:cs="Lexend"/>
-                <w:b/>
-                <w:bCs/>
-                <w:color w:val="193989"/>
-              </w:rPr>
-              <w:t xml:space="preserve"> </w:t>
+              <w:t xml:space="preserve">Reported By : </w:t>
             </w:r>
           </w:p>
         </w:tc>
@@ -890,27 +669,7 @@
                 <w:bCs/>
                 <w:color w:val="193989"/>
               </w:rPr>
-              <w:t xml:space="preserve">Verified </w:t>
-            </w:r>
-            <w:proofErr w:type="gramStart"/>
-            <w:r>
-              <w:rPr>
-                <w:rFonts w:ascii="Lexend" w:eastAsia="Lexend" w:hAnsi="Lexend" w:cs="Lexend"/>
-                <w:b/>
-                <w:bCs/>
-                <w:color w:val="193989"/>
-              </w:rPr>
-              <w:t>By :</w:t>
-            </w:r>
-            <w:proofErr w:type="gramEnd"/>
-            <w:r>
-              <w:rPr>
-                <w:rFonts w:ascii="Lexend" w:eastAsia="Lexend" w:hAnsi="Lexend" w:cs="Lexend"/>
-                <w:b/>
-                <w:bCs/>
-                <w:color w:val="193989"/>
-              </w:rPr>
-              <w:t xml:space="preserve"> </w:t>
+              <w:t xml:space="preserve">Verified By : </w:t>
             </w:r>
           </w:p>
         </w:tc>
@@ -952,23 +711,7 @@
                 <w:rFonts w:ascii="Lexend" w:eastAsia="Lexend" w:hAnsi="Lexend" w:cs="Lexend"/>
                 <w:color w:val="193989"/>
               </w:rPr>
-              <w:t>${</w:t>
-            </w:r>
-            <w:proofErr w:type="spellStart"/>
-            <w:r>
-              <w:rPr>
-                <w:rFonts w:ascii="Lexend" w:eastAsia="Lexend" w:hAnsi="Lexend" w:cs="Lexend"/>
-                <w:color w:val="193989"/>
-              </w:rPr>
-              <w:t>fullname</w:t>
-            </w:r>
-            <w:proofErr w:type="spellEnd"/>
-            <w:r>
-              <w:rPr>
-                <w:rFonts w:ascii="Lexend" w:eastAsia="Lexend" w:hAnsi="Lexend" w:cs="Lexend"/>
-                <w:color w:val="193989"/>
-              </w:rPr>
-              <w:t>}</w:t>
+              <w:t>${fullname}</w:t>
             </w:r>
           </w:p>
           <w:p>
@@ -1043,27 +786,7 @@
                 <w:bCs/>
                 <w:color w:val="193989"/>
               </w:rPr>
-              <w:t>${</w:t>
-            </w:r>
-            <w:proofErr w:type="spellStart"/>
-            <w:r>
-              <w:rPr>
-                <w:rFonts w:ascii="Lexend" w:eastAsia="Lexend" w:hAnsi="Lexend" w:cs="Lexend"/>
-                <w:b/>
-                <w:bCs/>
-                <w:color w:val="193989"/>
-              </w:rPr>
-              <w:t>performedby</w:t>
-            </w:r>
-            <w:proofErr w:type="spellEnd"/>
-            <w:r>
-              <w:rPr>
-                <w:rFonts w:ascii="Lexend" w:eastAsia="Lexend" w:hAnsi="Lexend" w:cs="Lexend"/>
-                <w:b/>
-                <w:bCs/>
-                <w:color w:val="193989"/>
-              </w:rPr>
-              <w:t>}</w:t>
+              <w:t>${performedby}</w:t>
             </w:r>
           </w:p>
           <w:p>
@@ -1991,6 +1714,7 @@
   <w:style w:type="character" w:default="1" w:styleId="DefaultParagraphFont">
     <w:name w:val="Default Paragraph Font"/>
     <w:uiPriority w:val="1"/>
+    <w:semiHidden/>
     <w:unhideWhenUsed/>
   </w:style>
   <w:style w:type="table" w:default="1" w:styleId="TableNormal">

</xml_diff>